<commit_message>
第 22–23 章:監控端點保護(JMX exporter HTTPS+Basic、blackbox mTLS、Prometheus/Alertmanager 帳號分開)與憑證到期監控、不停機換憑證
- 官方 JMX exporter 設定(SHA-256 釘住)+ TLS 版本;blackbox 探測 12 個端點;ops_rules_cert.yml
- scripts/cert-lab.sh、ch23-cert-rotation.sh、Lab 23;回退一律走 INTERNAL mTLS 帶外路徑
- 新增 scripts/lib、CONTRIBUTING.md、check.sh(腳本可讀性工具,尚未套用到舊腳本)
- 驗證:第 21、22、23 章整章 0 失敗;verify-doc 21(7)/22(10)/23(8) 0 不符合;ha-lab.sh 的 grep 加 -a(輸出含 NUL 時被當二進位)
- 手冊 v2 完整版/精簡版與銀行導入手冊重產

Co-Authored-By: Claude Sonnet 5.5 <noreply@anthropic.com>
</commit_message>
<xml_diff>
--- a/Confluent-Platform-銀行導入手冊.docx
+++ b/Confluent-Platform-銀行導入手冊.docx
@@ -15958,10 +15958,118 @@
       <w:r>
         <w:rPr>
           <w:rFonts w:ascii="Microsoft JhengHei" w:cs="Microsoft JhengHei" w:eastAsia="Microsoft JhengHei" w:hAnsi="Microsoft JhengHei"/>
+          <w:b/>
+          <w:bCs/>
           <w:sz w:val="21"/>
           <w:szCs w:val="21"/>
         </w:rPr>
-        <w:t xml:space="preserve">JMX exporter 的 /metrics 沒有認證:防火牆只開給 Prometheus,或啟用 exporter 的 TLS 與帳密(本案未實測);只匯出告警需要的 MBean。必須有「監控的監控」告警(抓不到 exporter 就告警)。</w:t>
+        <w:t xml:space="preserve">監控端點要保護</w:t>
+      </w:r>
+      <w:r>
+        <w:rPr>
+          <w:rFonts w:ascii="Microsoft JhengHei" w:cs="Microsoft JhengHei" w:eastAsia="Microsoft JhengHei" w:hAnsi="Microsoft JhengHei"/>
+          <w:sz w:val="21"/>
+          <w:szCs w:val="21"/>
+        </w:rPr>
+        <w:t xml:space="preserve">(Prometheus 官方安全文件與一般企業做法;沒有找到金融業專屬的公開規範,PCI DSS 的對應是通用解讀):(1) 所有端點 TLS,Prometheus 驗證憑證鏈、不跳過驗證;(2) 能 mTLS 就 mTLS,不行才 Basic 帳密,且只跑在 TLS 上;(3) 密碼不寫在設定檔(Prometheus 用 password_file,正式環境由 CyberArk 保管與輪替);(4) 網路層只允許 Prometheus 連 exporter 埠;(5) 要做負面測試(沒有憑證或帳密必須被拒)。</w:t>
+      </w:r>
+      <w:r>
+        <w:rPr>
+          <w:rFonts w:ascii="Microsoft JhengHei" w:cs="Microsoft JhengHei" w:eastAsia="Microsoft JhengHei" w:hAnsi="Microsoft JhengHei"/>
+          <w:b/>
+          <w:bCs/>
+          <w:color w:val="B45309"/>
+          <w:sz w:val="18"/>
+          <w:szCs w:val="18"/>
+        </w:rPr>
+        <w:t xml:space="preserve">〔社群或第三方〕</w:t>
+      </w:r>
+      <w:r>
+        <w:rPr>
+          <w:rFonts w:ascii="Microsoft JhengHei" w:cs="Microsoft JhengHei" w:eastAsia="Microsoft JhengHei" w:hAnsi="Microsoft JhengHei"/>
+          <w:b/>
+          <w:bCs/>
+          <w:color w:val="1F5FA8"/>
+          <w:sz w:val="18"/>
+          <w:szCs w:val="18"/>
+        </w:rPr>
+        <w:t xml:space="preserve">〔本案實測〕</w:t>
+      </w:r>
+    </w:p>
+    <w:p>
+      <w:pPr>
+        <w:pStyle w:val="ListParagraph"/>
+        <w:numPr>
+          <w:ilvl w:val="0"/>
+          <w:numId w:val="2"/>
+        </w:numPr>
+        <w:spacing w:after="60" w:line="290"/>
+      </w:pPr>
+      <w:r>
+        <w:rPr>
+          <w:rFonts w:ascii="Microsoft JhengHei" w:cs="Microsoft JhengHei" w:eastAsia="Microsoft JhengHei" w:hAnsi="Microsoft JhengHei"/>
+          <w:sz w:val="21"/>
+          <w:szCs w:val="21"/>
+        </w:rPr>
+        <w:t xml:space="preserve">本案實測:JMX exporter 1.0.1 只支援 HTTPS + Basic(PBKDF2-HMAC-SHA512),不支援 mTLS,6 個節點都套用;</w:t>
+      </w:r>
+      <w:r>
+        <w:rPr>
+          <w:rFonts w:ascii="Microsoft JhengHei" w:cs="Microsoft JhengHei" w:eastAsia="Microsoft JhengHei" w:hAnsi="Microsoft JhengHei"/>
+          <w:b/>
+          <w:bCs/>
+          <w:sz w:val="21"/>
+          <w:szCs w:val="21"/>
+        </w:rPr>
+        <w:t xml:space="preserve">blackbox exporter 依 URL 參數替人連任意位址、又帶 client 憑證,Prometheus 官方特別警告,所以用 HTTPS + mTLS</w:t>
+      </w:r>
+      <w:r>
+        <w:rPr>
+          <w:rFonts w:ascii="Microsoft JhengHei" w:cs="Microsoft JhengHei" w:eastAsia="Microsoft JhengHei" w:hAnsi="Microsoft JhengHei"/>
+          <w:sz w:val="21"/>
+          <w:szCs w:val="21"/>
+        </w:rPr>
+        <w:t xml:space="preserve">(Prometheus 帶專用 client 憑證)。各元件的 exporter 設定直接用 Confluent 官方 jmx-monitoring-stacks 的檔案,不自己重寫(官方檔每台 broker 約 1 萬 2 千個時間序列,startDelaySeconds 120)。網路層防火牆與密碼輪替未實測。</w:t>
+      </w:r>
+      <w:r>
+        <w:rPr>
+          <w:rFonts w:ascii="Microsoft JhengHei" w:cs="Microsoft JhengHei" w:eastAsia="Microsoft JhengHei" w:hAnsi="Microsoft JhengHei"/>
+          <w:b/>
+          <w:bCs/>
+          <w:color w:val="1F5FA8"/>
+          <w:sz w:val="18"/>
+          <w:szCs w:val="18"/>
+        </w:rPr>
+        <w:t xml:space="preserve">〔本案實測〕</w:t>
+      </w:r>
+      <w:r>
+        <w:rPr>
+          <w:rFonts w:ascii="Microsoft JhengHei" w:cs="Microsoft JhengHei" w:eastAsia="Microsoft JhengHei" w:hAnsi="Microsoft JhengHei"/>
+          <w:b/>
+          <w:bCs/>
+          <w:color w:val="B03A2E"/>
+          <w:sz w:val="18"/>
+          <w:szCs w:val="18"/>
+        </w:rPr>
+        <w:t xml:space="preserve">〔推論,未找到明載〕</w:t>
+      </w:r>
+    </w:p>
+    <w:p>
+      <w:pPr>
+        <w:pStyle w:val="ListParagraph"/>
+        <w:numPr>
+          <w:ilvl w:val="0"/>
+          <w:numId w:val="2"/>
+        </w:numPr>
+        <w:spacing w:after="60" w:line="290"/>
+      </w:pPr>
+      <w:r>
+        <w:rPr>
+          <w:rFonts w:ascii="Microsoft JhengHei" w:cs="Microsoft JhengHei" w:eastAsia="Microsoft JhengHei" w:hAnsi="Microsoft JhengHei"/>
+          <w:sz w:val="21"/>
+          <w:szCs w:val="21"/>
+        </w:rPr>
+        <w:t xml:space="preserve">必須有「監控的監控」告警(抓不到 exporter 就告警)。</w:t>
       </w:r>
       <w:r>
         <w:rPr>
@@ -32055,7 +32163,7 @@
                 <w:sz w:val="19"/>
                 <w:szCs w:val="19"/>
               </w:rPr>
-              <w:t xml:space="preserve">以容器環境實測過 agent 載入與告警(Lab 22);VM 上的做法官方步驟沒有找到,參數相同但未在 VM 驗證</w:t>
+              <w:t xml:space="preserve">以容器環境實測過 agent 載入、告警與端點保護(Lab 22);VM 上的做法官方步驟沒有找到,參數相同但未在 VM 驗證;網路層防火牆限制、exporter 密碼輪替未實測</w:t>
             </w:r>
           </w:p>
         </w:tc>

</xml_diff>

<commit_message>
第 26 章:Grafana 全元件監控(官方儀表板、node_exporter、kafka_exporter、AD 登入);Lab 26、手冊重產
- Grafana(HTTPS、AD LDAPS 登入、群組對映角色、只讀 Prometheus 帳號)、官方 jmx-monitoring-stacks KRaft 儀表板(固定 commit、校驗 SHA-256、不改內容)+ 自製「主機與 consumer lag」儀表板
- node_exporter(mTLS)、kafka_exporter(社群專案;mTLS;專屬 SCRAM 帳號 + Describe-only ACL);config/c3/ops_rules_host.yml(磁碟、lag 告警)
- 抓取 job 改為官方慣例 kafka-broker / kafka-controller + env 標籤(ops_rules_jmx、monitor-lab 同步);server 憑證補 SAN;scripts/grafana.sh、grafana-lab.sh、lib/dash-coverage.mjs
- 實測:官方儀表板 150 個查詢約 108 個有資料;lag 告警觸發與解除;新 group 未提交 offset 的分區不會算 lag(陷阱)
- 修正:monitor-lab rules 等前一實驗的告警解除、ha.sh 重建時移除 grafana 抓取設定、ha-lab ctrls-down 偶發 0 筆加重試
- 驗證:從零重建後第 21–26 章整章 0 失敗;verify-doc 第 21、22、26 章 0 不符合

Co-Authored-By: Claude Sonnet 5.5 <noreply@anthropic.com>
</commit_message>
<xml_diff>
--- a/Confluent-Platform-銀行導入手冊.docx
+++ b/Confluent-Platform-銀行導入手冊.docx
@@ -16160,6 +16160,175 @@
       <w:r>
         <w:rPr>
           <w:rFonts w:ascii="Microsoft JhengHei" w:cs="Microsoft JhengHei" w:eastAsia="Microsoft JhengHei" w:hAnsi="Microsoft JhengHei"/>
+          <w:b/>
+          <w:bCs/>
+          <w:color w:val="1F5FA8"/>
+          <w:sz w:val="18"/>
+          <w:szCs w:val="18"/>
+        </w:rPr>
+        <w:t xml:space="preserve">〔本案實測〕</w:t>
+      </w:r>
+      <w:r>
+        <w:rPr>
+          <w:rFonts w:ascii="Microsoft JhengHei" w:cs="Microsoft JhengHei" w:eastAsia="Microsoft JhengHei" w:hAnsi="Microsoft JhengHei"/>
+          <w:sz w:val="21"/>
+          <w:szCs w:val="21"/>
+        </w:rPr>
+        <w:t xml:space="preserve"> </w:t>
+      </w:r>
+      <w:r>
+        <w:rPr>
+          <w:rFonts w:ascii="Microsoft JhengHei" w:cs="Microsoft JhengHei" w:eastAsia="Microsoft JhengHei" w:hAnsi="Microsoft JhengHei"/>
+          <w:b/>
+          <w:bCs/>
+          <w:sz w:val="21"/>
+          <w:szCs w:val="21"/>
+        </w:rPr>
+        <w:t xml:space="preserve">Grafana 全元件儀表板(Lab 26)</w:t>
+      </w:r>
+      <w:r>
+        <w:rPr>
+          <w:rFonts w:ascii="Microsoft JhengHei" w:cs="Microsoft JhengHei" w:eastAsia="Microsoft JhengHei" w:hAnsi="Microsoft JhengHei"/>
+          <w:sz w:val="21"/>
+          <w:szCs w:val="21"/>
+        </w:rPr>
+        <w:t xml:space="preserve">:C3 只看 broker 與 controller,Grafana 可涵蓋全部。本案把 Grafana 接上 Prometheus,匯入 Confluent 官方 jmx-monitoring-stacks 的 KRaft 儀表板(固定 commit、校驗 SHA-256、不改內容);為了讓官方查詢對得上,抓取 job 用官方慣例的 `kafka-broker`、`kafka-controller` 與 `env` 標籤。</w:t>
+      </w:r>
+      <w:r>
+        <w:rPr>
+          <w:rFonts w:ascii="Microsoft JhengHei" w:cs="Microsoft JhengHei" w:eastAsia="Microsoft JhengHei" w:hAnsi="Microsoft JhengHei"/>
+          <w:b/>
+          <w:bCs/>
+          <w:sz w:val="21"/>
+          <w:szCs w:val="21"/>
+        </w:rPr>
+        <w:t xml:space="preserve">匯入成功不等於有資料</w:t>
+      </w:r>
+      <w:r>
+        <w:rPr>
+          <w:rFonts w:ascii="Microsoft JhengHei" w:cs="Microsoft JhengHei" w:eastAsia="Microsoft JhengHei" w:hAnsi="Microsoft JhengHei"/>
+          <w:sz w:val="21"/>
+          <w:szCs w:val="21"/>
+        </w:rPr>
+        <w:t xml:space="preserve">:實測 150 個查詢中約 108 個有資料,沒資料的是環境沒有的功能(Tiered Storage、Schema Registry、Connect)、KRaft 下 offline partitions 在 controller 而儀表板查 broker、JMX exporter 1.x 的指標命名與儀表板不同(例如 `jvm_memory_bytes_max`),以及官方設定在本環境沒有輸出的 raft、socket-server、auth-store 指標(原因未深入查,導入時要再確認)。Grafana 本身:HTTPS、AD(LDAPS)登入並以群組對映角色、本機 admin 只留 break-glass、資料來源用只讀帳號、儀表板由檔案載入不可在畫面上改。</w:t>
+      </w:r>
+    </w:p>
+    <w:p>
+      <w:pPr>
+        <w:pStyle w:val="ListParagraph"/>
+        <w:numPr>
+          <w:ilvl w:val="0"/>
+          <w:numId w:val="2"/>
+        </w:numPr>
+        <w:spacing w:after="60" w:line="290"/>
+      </w:pPr>
+      <w:r>
+        <w:rPr>
+          <w:rFonts w:ascii="Microsoft JhengHei" w:cs="Microsoft JhengHei" w:eastAsia="Microsoft JhengHei" w:hAnsi="Microsoft JhengHei"/>
+          <w:b/>
+          <w:bCs/>
+          <w:color w:val="1F5FA8"/>
+          <w:sz w:val="18"/>
+          <w:szCs w:val="18"/>
+        </w:rPr>
+        <w:t xml:space="preserve">〔本案實測〕</w:t>
+      </w:r>
+      <w:r>
+        <w:rPr>
+          <w:rFonts w:ascii="Microsoft JhengHei" w:cs="Microsoft JhengHei" w:eastAsia="Microsoft JhengHei" w:hAnsi="Microsoft JhengHei"/>
+          <w:sz w:val="21"/>
+          <w:szCs w:val="21"/>
+        </w:rPr>
+        <w:t xml:space="preserve"> 補上 Lab 22 缺的兩類指標:</w:t>
+      </w:r>
+      <w:r>
+        <w:rPr>
+          <w:rFonts w:ascii="Microsoft JhengHei" w:cs="Microsoft JhengHei" w:eastAsia="Microsoft JhengHei" w:hAnsi="Microsoft JhengHei"/>
+          <w:b/>
+          <w:bCs/>
+          <w:sz w:val="21"/>
+          <w:szCs w:val="21"/>
+        </w:rPr>
+        <w:t xml:space="preserve">node_exporter</w:t>
+      </w:r>
+      <w:r>
+        <w:rPr>
+          <w:rFonts w:ascii="Microsoft JhengHei" w:cs="Microsoft JhengHei" w:eastAsia="Microsoft JhengHei" w:hAnsi="Microsoft JhengHei"/>
+          <w:sz w:val="21"/>
+          <w:szCs w:val="21"/>
+        </w:rPr>
+        <w:t xml:space="preserve">(Prometheus 官方,磁碟用量等主機指標,mTLS 保護)與 </w:t>
+      </w:r>
+      <w:r>
+        <w:rPr>
+          <w:rFonts w:ascii="Microsoft JhengHei" w:cs="Microsoft JhengHei" w:eastAsia="Microsoft JhengHei" w:hAnsi="Microsoft JhengHei"/>
+          <w:b/>
+          <w:bCs/>
+          <w:sz w:val="21"/>
+          <w:szCs w:val="21"/>
+        </w:rPr>
+        <w:t xml:space="preserve">kafka_exporter</w:t>
+      </w:r>
+      <w:r>
+        <w:rPr>
+          <w:rFonts w:ascii="Microsoft JhengHei" w:cs="Microsoft JhengHei" w:eastAsia="Microsoft JhengHei" w:hAnsi="Microsoft JhengHei"/>
+          <w:sz w:val="21"/>
+          <w:szCs w:val="21"/>
+        </w:rPr>
+        <w:t xml:space="preserve">(社群專案 danielqsj,consumer lag;自己的網頁走 mTLS,連 Kafka 用專屬 SCRAM 帳號加只有 Describe 的 ACL——實測看得到 topic、group、offset,讀訊息被拒)。consumer 落後 4000 筆時 lag 告警約 3 分鐘觸發、追上後解除;告警門檻是範例值。磁碟告警只驗證規則已載入,沒有實際塞滿磁碟觸發。</w:t>
+      </w:r>
+      <w:r>
+        <w:rPr>
+          <w:rFonts w:ascii="Microsoft JhengHei" w:cs="Microsoft JhengHei" w:eastAsia="Microsoft JhengHei" w:hAnsi="Microsoft JhengHei"/>
+          <w:b/>
+          <w:bCs/>
+          <w:color w:val="B45309"/>
+          <w:sz w:val="18"/>
+          <w:szCs w:val="18"/>
+        </w:rPr>
+        <w:t xml:space="preserve">〔社群或第三方〕</w:t>
+      </w:r>
+    </w:p>
+    <w:p>
+      <w:pPr>
+        <w:pStyle w:val="ListParagraph"/>
+        <w:numPr>
+          <w:ilvl w:val="0"/>
+          <w:numId w:val="2"/>
+        </w:numPr>
+        <w:spacing w:after="60" w:line="290"/>
+      </w:pPr>
+      <w:r>
+        <w:rPr>
+          <w:rFonts w:ascii="Microsoft JhengHei" w:cs="Microsoft JhengHei" w:eastAsia="Microsoft JhengHei" w:hAnsi="Microsoft JhengHei"/>
+          <w:b/>
+          <w:bCs/>
+          <w:sz w:val="21"/>
+          <w:szCs w:val="21"/>
+        </w:rPr>
+        <w:t xml:space="preserve">日誌與追蹤</w:t>
+      </w:r>
+      <w:r>
+        <w:rPr>
+          <w:rFonts w:ascii="Microsoft JhengHei" w:cs="Microsoft JhengHei" w:eastAsia="Microsoft JhengHei" w:hAnsi="Microsoft JhengHei"/>
+          <w:sz w:val="21"/>
+          <w:szCs w:val="21"/>
+        </w:rPr>
+        <w:t xml:space="preserve">(Loki、Tempo、OpenTelemetry Collector 並以 Kafka 當傳輸緩衝)規劃於 Lab 27,尚未驗證。</w:t>
+      </w:r>
+    </w:p>
+    <w:p>
+      <w:pPr>
+        <w:pStyle w:val="ListParagraph"/>
+        <w:numPr>
+          <w:ilvl w:val="0"/>
+          <w:numId w:val="2"/>
+        </w:numPr>
+        <w:spacing w:after="60" w:line="290"/>
+      </w:pPr>
+      <w:r>
+        <w:rPr>
+          <w:rFonts w:ascii="Microsoft JhengHei" w:cs="Microsoft JhengHei" w:eastAsia="Microsoft JhengHei" w:hAnsi="Microsoft JhengHei"/>
           <w:sz w:val="21"/>
           <w:szCs w:val="21"/>
         </w:rPr>
@@ -31955,6 +32124,76 @@
                 <w:szCs w:val="19"/>
               </w:rPr>
               <w:t xml:space="preserve">只有文件整理,未實測</w:t>
+            </w:r>
+          </w:p>
+        </w:tc>
+      </w:tr>
+      <w:tr>
+        <w:trPr>
+          <w:cantSplit/>
+        </w:trPr>
+        <w:tc>
+          <w:tcPr>
+            <w:tcW w:type="dxa" w:w="4284"/>
+            <w:tcBorders>
+              <w:top w:val="single" w:color="BFBFBF" w:sz="4"/>
+              <w:left w:val="single" w:color="BFBFBF" w:sz="4"/>
+              <w:bottom w:val="single" w:color="BFBFBF" w:sz="4"/>
+              <w:right w:val="single" w:color="BFBFBF" w:sz="4"/>
+            </w:tcBorders>
+            <w:shd w:fill="EEF2F7" w:val="clear"/>
+            <w:tcMar>
+              <w:top w:type="dxa" w:w="60"/>
+              <w:left w:type="dxa" w:w="100"/>
+              <w:bottom w:type="dxa" w:w="60"/>
+              <w:right w:type="dxa" w:w="100"/>
+            </w:tcMar>
+          </w:tcPr>
+          <w:p>
+            <w:pPr>
+              <w:spacing w:after="30" w:line="270"/>
+            </w:pPr>
+            <w:r>
+              <w:rPr>
+                <w:rFonts w:ascii="Microsoft JhengHei" w:cs="Microsoft JhengHei" w:eastAsia="Microsoft JhengHei" w:hAnsi="Microsoft JhengHei"/>
+                <w:b/>
+                <w:bCs/>
+                <w:sz w:val="19"/>
+                <w:szCs w:val="19"/>
+              </w:rPr>
+              <w:t xml:space="preserve">Grafana 全元件監控(Lab 26)</w:t>
+            </w:r>
+          </w:p>
+        </w:tc>
+        <w:tc>
+          <w:tcPr>
+            <w:tcW w:type="dxa" w:w="5354"/>
+            <w:tcBorders>
+              <w:top w:val="single" w:color="BFBFBF" w:sz="4"/>
+              <w:left w:val="single" w:color="BFBFBF" w:sz="4"/>
+              <w:bottom w:val="single" w:color="BFBFBF" w:sz="4"/>
+              <w:right w:val="single" w:color="BFBFBF" w:sz="4"/>
+            </w:tcBorders>
+            <w:tcMar>
+              <w:top w:type="dxa" w:w="60"/>
+              <w:left w:type="dxa" w:w="100"/>
+              <w:bottom w:type="dxa" w:w="60"/>
+              <w:right w:type="dxa" w:w="100"/>
+            </w:tcMar>
+          </w:tcPr>
+          <w:p>
+            <w:pPr>
+              <w:spacing w:after="30" w:line="270"/>
+            </w:pPr>
+            <w:r>
+              <w:rPr>
+                <w:rFonts w:ascii="Microsoft JhengHei" w:cs="Microsoft JhengHei" w:eastAsia="Microsoft JhengHei" w:hAnsi="Microsoft JhengHei"/>
+                <w:b w:val="false"/>
+                <w:bCs w:val="false"/>
+                <w:sz w:val="19"/>
+                <w:szCs w:val="19"/>
+              </w:rPr>
+              <w:t xml:space="preserve">已實測:官方 KRaft 儀表板 150 個查詢約 108 個有資料(107 到 108,隨環境略有出入)、node_exporter 與 kafka_exporter、AD 登入;未測:磁碟告警實際觸發、Grafana 高可用與外部資料庫、Grafana 告警(本案告警走 Prometheus)、raft 與 socket-server 指標缺漏的原因</w:t>
             </w:r>
           </w:p>
         </w:tc>

</xml_diff>

<commit_message>
第 27 章:日誌與追蹤經過 Kafka 進 Loki 與 Tempo(Grafana Alloy 搬運);Lab 27、手冊重產
- config/observability(loki.yml、tempo.yml、config.alloy)、docker-compose.ha.yml 的 loki / tempo / alloy(profile observability)、scripts/observability.sh、observe-lab.sh、lib/tempo-traces.mjs、scenarios/ch27
- Grafana 加 Loki / Tempo 資料來源(mTLS);server 憑證補 SAN loki、tempo;lib/apps.sh 支援 APP_JAVA_OPTS 與 /otel 掛載(OpenTelemetry Java agent 2.32.0,校驗 checksums.txt)
- 實測:日誌經 Kafka 進 Loki;Loki 停機約 1 分鐘恢復後 980 = 980;trace 跨過 Kafka 串起 producer 與 consumer(程式碼不改);稽核事件進 Loki;alloy-producer / alloy-consumer 最小權限
- 驗證:第 27 章整章 0 失敗、verify-doc 6 步 0 不符合;RUNBOOK、DESIGN-BASIS、銀行導入手冊、路線圖同步

Co-Authored-By: Claude Sonnet 5.5 <noreply@anthropic.com>
</commit_message>
<xml_diff>
--- a/Confluent-Platform-銀行導入手冊.docx
+++ b/Confluent-Platform-銀行導入手冊.docx
@@ -16287,6 +16287,71 @@
           <w:szCs w:val="18"/>
         </w:rPr>
         <w:t xml:space="preserve">〔社群或第三方〕</w:t>
+      </w:r>
+    </w:p>
+    <w:p>
+      <w:pPr>
+        <w:pStyle w:val="ListParagraph"/>
+        <w:numPr>
+          <w:ilvl w:val="0"/>
+          <w:numId w:val="2"/>
+        </w:numPr>
+        <w:spacing w:after="60" w:line="290"/>
+      </w:pPr>
+      <w:r>
+        <w:rPr>
+          <w:rFonts w:ascii="Microsoft JhengHei" w:cs="Microsoft JhengHei" w:eastAsia="Microsoft JhengHei" w:hAnsi="Microsoft JhengHei"/>
+          <w:b/>
+          <w:bCs/>
+          <w:color w:val="1F5FA8"/>
+          <w:sz w:val="18"/>
+          <w:szCs w:val="18"/>
+        </w:rPr>
+        <w:t xml:space="preserve">〔本案實測〕</w:t>
+      </w:r>
+      <w:r>
+        <w:rPr>
+          <w:rFonts w:ascii="Microsoft JhengHei" w:cs="Microsoft JhengHei" w:eastAsia="Microsoft JhengHei" w:hAnsi="Microsoft JhengHei"/>
+          <w:sz w:val="21"/>
+          <w:szCs w:val="21"/>
+        </w:rPr>
+        <w:t xml:space="preserve"> </w:t>
+      </w:r>
+      <w:r>
+        <w:rPr>
+          <w:rFonts w:ascii="Microsoft JhengHei" w:cs="Microsoft JhengHei" w:eastAsia="Microsoft JhengHei" w:hAnsi="Microsoft JhengHei"/>
+          <w:b/>
+          <w:bCs/>
+          <w:sz w:val="21"/>
+          <w:szCs w:val="21"/>
+        </w:rPr>
+        <w:t xml:space="preserve">日誌與追蹤經 Kafka(Lab 27)</w:t>
+      </w:r>
+      <w:r>
+        <w:rPr>
+          <w:rFonts w:ascii="Microsoft JhengHei" w:cs="Microsoft JhengHei" w:eastAsia="Microsoft JhengHei" w:hAnsi="Microsoft JhengHei"/>
+          <w:sz w:val="21"/>
+          <w:szCs w:val="21"/>
+        </w:rPr>
+        <w:t xml:space="preserve">:平台日誌與應用程式 trace 先寫進 Kafka(otel-logs、otel-traces),再由 Grafana Alloy 讀出送進 Loki 與 Tempo(兩者皆 mTLS)。實測:Loki 停機約 1 分鐘,容器日誌 980 行 = Loki 980 行,一筆不少——Kafka 當緩衝讓下游可以維護,保留期(本案 6 小時,範例值)是可停機的上限,Alloy 的 consumer lag 要監控;OpenTelemetry Java agent 不改程式碼,trace context 隨訊息標頭傳遞,一個 trace 串起 producer 與 consumer(agent 在 `java 檔名.java` 方式下要明確啟用);稽核 topic 也進 Loki 供同一處查詢。寫與讀用不同的 SCRAM 帳號、各自最小 ACL。</w:t>
+      </w:r>
+      <w:r>
+        <w:rPr>
+          <w:rFonts w:ascii="Microsoft JhengHei" w:cs="Microsoft JhengHei" w:eastAsia="Microsoft JhengHei" w:hAnsi="Microsoft JhengHei"/>
+          <w:b/>
+          <w:bCs/>
+          <w:sz w:val="21"/>
+          <w:szCs w:val="21"/>
+        </w:rPr>
+        <w:t xml:space="preserve">未驗證</w:t>
+      </w:r>
+      <w:r>
+        <w:rPr>
+          <w:rFonts w:ascii="Microsoft JhengHei" w:cs="Microsoft JhengHei" w:eastAsia="Microsoft JhengHei" w:hAnsi="Microsoft JhengHei"/>
+          <w:sz w:val="21"/>
+          <w:szCs w:val="21"/>
+        </w:rPr>
+        <w:t xml:space="preserve">:Loki / Tempo 高可用與物件儲存、取樣與脫敏、Loki 的存取控制與不可竄改(Loki 本身沒有 RBAC)、Alloy 高可用。</w:t>
       </w:r>
     </w:p>
     <w:p>

</xml_diff>

<commit_message>
第 31 章 Self-Balancing、第 32 章 Tiered Storage(MinIO);手冊、簡報 v6 重產
- Lab 31:啟用(controller 也要設 enable 與 inter.broker.listener.name)、加空 broker(等指標視窗約 15–20 分鐘)、
  kafka-remove-brokers、負載不均不觸發的條件;全新環境整章 0 失敗,手冊自檢 5 步 0 不符合
- Lab 32:MinIO(HTTPS、專用帳號)Tiered Storage:上傳、本機清理、從頭讀、重啟、存取保護;
  踩坑:cred.file 格式、SSE 需 KMS、JVM 信任庫、kafka-log-dirs 是邏輯大小;整章 0 失敗,自檢 7 步 0 不符合
- 第 21–23 章手冊自檢在 HA 全新環境重跑,25 步 0 不符合
- make-certs.sh SAN 補 broker4、minio;ha.sh 清 SBC_ENABLE 與 tier/sbc profile;check.sh lint 清單擴充
- 手冊(完整/精簡/銀行導入)、簡報 v6(新增「容量與成本」頁)重產

Co-Authored-By: Claude Sonnet 5.5 <noreply@anthropic.com>
</commit_message>
<xml_diff>
--- a/Confluent-Platform-銀行導入手冊.docx
+++ b/Confluent-Platform-銀行導入手冊.docx
@@ -16445,6 +16445,136 @@
           <w:szCs w:val="21"/>
         </w:rPr>
         <w:t xml:space="preserve">:接真正的行內郵件伺服器(驗證方式、relay 限制、SPF / DKIM)、簡訊 / 通訊軟體 / 工單 webhook、靜音與抑制規則、Alertmanager 高可用、通知失敗的備援。</w:t>
+      </w:r>
+    </w:p>
+    <w:p>
+      <w:pPr>
+        <w:pStyle w:val="ListParagraph"/>
+        <w:numPr>
+          <w:ilvl w:val="0"/>
+          <w:numId w:val="2"/>
+        </w:numPr>
+        <w:spacing w:after="60" w:line="290"/>
+      </w:pPr>
+      <w:r>
+        <w:rPr>
+          <w:rFonts w:ascii="Microsoft JhengHei" w:cs="Microsoft JhengHei" w:eastAsia="Microsoft JhengHei" w:hAnsi="Microsoft JhengHei"/>
+          <w:b/>
+          <w:bCs/>
+          <w:color w:val="1F5FA8"/>
+          <w:sz w:val="18"/>
+          <w:szCs w:val="18"/>
+        </w:rPr>
+        <w:t xml:space="preserve">〔本案實測〕</w:t>
+      </w:r>
+      <w:r>
+        <w:rPr>
+          <w:rFonts w:ascii="Microsoft JhengHei" w:cs="Microsoft JhengHei" w:eastAsia="Microsoft JhengHei" w:hAnsi="Microsoft JhengHei"/>
+          <w:sz w:val="21"/>
+          <w:szCs w:val="21"/>
+        </w:rPr>
+        <w:t xml:space="preserve"> </w:t>
+      </w:r>
+      <w:r>
+        <w:rPr>
+          <w:rFonts w:ascii="Microsoft JhengHei" w:cs="Microsoft JhengHei" w:eastAsia="Microsoft JhengHei" w:hAnsi="Microsoft JhengHei"/>
+          <w:b/>
+          <w:bCs/>
+          <w:sz w:val="21"/>
+          <w:szCs w:val="21"/>
+        </w:rPr>
+        <w:t xml:space="preserve">Self-Balancing(Lab 31)</w:t>
+      </w:r>
+      <w:r>
+        <w:rPr>
+          <w:rFonts w:ascii="Microsoft JhengHei" w:cs="Microsoft JhengHei" w:eastAsia="Microsoft JhengHei" w:hAnsi="Microsoft JhengHei"/>
+          <w:sz w:val="21"/>
+          <w:szCs w:val="21"/>
+        </w:rPr>
+        <w:t xml:space="preserve">:KRaft 下 balancer 跑在 active controller,`confluent.balancer.enable` 與 `inter.broker.listener.name` 要設在每台 controller 與 broker(只動態開 broker 狀態仍是 DISABLED),要滾動重啟。加空 broker 要先蒐集指標視窗,實測 15 到 20 分鐘才開始自動搬副本,搬家期間 20000 筆 acks=all 寫入全成功;`kafka-remove-brokers --delete` 約 3 分鐘搬完並關機、筆數不變;新建 topic 後約 18 分鐘內計畫算不出來。負載不均只在副本數與超過 20% 磁碟用量時觸發,小資料量不會搬。授權範圍、磁碟超過 20% 的重平衡、故障後自動補副本</w:t>
+      </w:r>
+      <w:r>
+        <w:rPr>
+          <w:rFonts w:ascii="Microsoft JhengHei" w:cs="Microsoft JhengHei" w:eastAsia="Microsoft JhengHei" w:hAnsi="Microsoft JhengHei"/>
+          <w:b/>
+          <w:bCs/>
+          <w:sz w:val="21"/>
+          <w:szCs w:val="21"/>
+        </w:rPr>
+        <w:t xml:space="preserve">未驗證</w:t>
+      </w:r>
+      <w:r>
+        <w:rPr>
+          <w:rFonts w:ascii="Microsoft JhengHei" w:cs="Microsoft JhengHei" w:eastAsia="Microsoft JhengHei" w:hAnsi="Microsoft JhengHei"/>
+          <w:sz w:val="21"/>
+          <w:szCs w:val="21"/>
+        </w:rPr>
+        <w:t xml:space="preserve">。</w:t>
+      </w:r>
+    </w:p>
+    <w:p>
+      <w:pPr>
+        <w:pStyle w:val="ListParagraph"/>
+        <w:numPr>
+          <w:ilvl w:val="0"/>
+          <w:numId w:val="2"/>
+        </w:numPr>
+        <w:spacing w:after="60" w:line="290"/>
+      </w:pPr>
+      <w:r>
+        <w:rPr>
+          <w:rFonts w:ascii="Microsoft JhengHei" w:cs="Microsoft JhengHei" w:eastAsia="Microsoft JhengHei" w:hAnsi="Microsoft JhengHei"/>
+          <w:b/>
+          <w:bCs/>
+          <w:color w:val="1F5FA8"/>
+          <w:sz w:val="18"/>
+          <w:szCs w:val="18"/>
+        </w:rPr>
+        <w:t xml:space="preserve">〔本案實測〕</w:t>
+      </w:r>
+      <w:r>
+        <w:rPr>
+          <w:rFonts w:ascii="Microsoft JhengHei" w:cs="Microsoft JhengHei" w:eastAsia="Microsoft JhengHei" w:hAnsi="Microsoft JhengHei"/>
+          <w:sz w:val="21"/>
+          <w:szCs w:val="21"/>
+        </w:rPr>
+        <w:t xml:space="preserve"> </w:t>
+      </w:r>
+      <w:r>
+        <w:rPr>
+          <w:rFonts w:ascii="Microsoft JhengHei" w:cs="Microsoft JhengHei" w:eastAsia="Microsoft JhengHei" w:hAnsi="Microsoft JhengHei"/>
+          <w:b/>
+          <w:bCs/>
+          <w:sz w:val="21"/>
+          <w:szCs w:val="21"/>
+        </w:rPr>
+        <w:t xml:space="preserve">Tiered Storage 到 MinIO(Lab 32)</w:t>
+      </w:r>
+      <w:r>
+        <w:rPr>
+          <w:rFonts w:ascii="Microsoft JhengHei" w:cs="Microsoft JhengHei" w:eastAsia="Microsoft JhengHei" w:hAnsi="Microsoft JhengHei"/>
+          <w:sz w:val="21"/>
+          <w:szCs w:val="21"/>
+        </w:rPr>
+        <w:t xml:space="preserve">:舊 segment 上傳到 S3 相容物件儲存(HTTPS、專用帳號只含 GetBucketLocation / PutObject / GetObject / DeleteObject)。100000 筆(約 100 MB)寫入後 20 到 30 秒開始上傳,本機從約 300 MB(3 副本)降到約 20 MB,從頭讀與 broker 重啟後仍讀到全部。三個踩坑:`cred.file.path` 要 accessKey= / secretKey= 的 properties 檔;預設伺服器端加密在沒有 KMS 的物件儲存回 501、上傳無限重試(topic 正常但沒有物件);HTTPS 要讓 JVM 信任行內 CA。`kafka-log-dirs` 是邏輯大小,看磁碟占用要量目錄。物件儲存中斷時的行為、回補讀取效能、授權範圍</w:t>
+      </w:r>
+      <w:r>
+        <w:rPr>
+          <w:rFonts w:ascii="Microsoft JhengHei" w:cs="Microsoft JhengHei" w:eastAsia="Microsoft JhengHei" w:hAnsi="Microsoft JhengHei"/>
+          <w:b/>
+          <w:bCs/>
+          <w:sz w:val="21"/>
+          <w:szCs w:val="21"/>
+        </w:rPr>
+        <w:t xml:space="preserve">未驗證</w:t>
+      </w:r>
+      <w:r>
+        <w:rPr>
+          <w:rFonts w:ascii="Microsoft JhengHei" w:cs="Microsoft JhengHei" w:eastAsia="Microsoft JhengHei" w:hAnsi="Microsoft JhengHei"/>
+          <w:sz w:val="21"/>
+          <w:szCs w:val="21"/>
+        </w:rPr>
+        <w:t xml:space="preserve">。</w:t>
       </w:r>
     </w:p>
     <w:p>

</xml_diff>

<commit_message>
Schema Registry、Connect、REST Proxy 掛 JMX exporter;Grafana 新增三個官方儀表板
- 官方 jmx-monitoring-stacks 同一釘定 commit 的設定檔(校驗 SHA-256)+ HTTPS + Basic,7778 埠
- Prometheus job 照官方命名(schema-registry、kafka-connect、rest-proxy),目標 35 個全部 up
- 第 22 章:13 個 exporter 都受保護(不帶帳密 / 錯密碼 401、明文無回應)
- 第 26 章:8 個官方儀表板 245 個查詢 171 個有資料(SR 12/13、REST 10/11、Connect 19/71);
  Connect 的連接器與 task 面板要有連接器在跑,判定改為另外判斷
- 修正舊拓樸數字(憑證監控對外 15 / 內部 7);.gitignore 補 confluent_*.yml(含密碼雜湊)

Co-Authored-By: Claude Opus 5.5 <noreply@anthropic.com>
</commit_message>
<xml_diff>
--- a/Confluent-Platform-銀行導入手冊.docx
+++ b/Confluent-Platform-銀行導入手冊.docx
@@ -16445,7 +16445,7 @@
           <w:sz w:val="21"/>
           <w:szCs w:val="21"/>
         </w:rPr>
-        <w:t xml:space="preserve">:實測 150 個查詢中 126 個有資料(broker 補上 JmxReporter 前只有 108 個);沒資料的是 Tiered Storage(基線沒開)、Schema Registry 與 Connect(本案還沒替這兩個元件掛 JMX exporter,導入時要補)、KRaft 下 offline partitions 在 controller 而儀表板查 broker、JMX exporter 1.x 的指標命名與儀表板不同(例如 `jvm_memory_bytes_max`)。Grafana 本身:HTTPS、AD(LDAPS)登入並以群組對映角色、本機 admin 只留 break-glass、資料來源用只讀帳號、儀表板由檔案載入不可在畫面上改。</w:t>
+        <w:t xml:space="preserve">:實測 8 個官方儀表板共 245 個查詢中 171 個有資料(broker 補上 JmxReporter 前 108 個;Schema Registry、Connect、REST Proxy 也掛上同一套 JMX exporter——官方設定檔 + HTTPS + Basic,Prometheus job 名稱照官方——之後這三個元件的儀表板才有資料);沒資料的是 Tiered Storage(基線沒開)、Connect 的連接器與 task 面板(要有連接器在跑)、KRaft 下 offline partitions 在 controller 而儀表板查 broker、JMX exporter 1.x 的指標命名與儀表板不同(例如 `jvm_memory_bytes_max`)。Grafana 本身:HTTPS、AD(LDAPS)登入並以群組對映角色、本機 admin 只留 break-glass、資料來源用只讀帳號、儀表板由檔案載入不可在畫面上改。</w:t>
       </w:r>
     </w:p>
     <w:p>
@@ -34243,7 +34243,7 @@
                 <w:sz w:val="19"/>
                 <w:szCs w:val="19"/>
               </w:rPr>
-              <w:t xml:space="preserve">已實測:官方 KRaft 儀表板 150 個查詢 125 到 126 個有資料、node_exporter 與 kafka_exporter、AD 登入;未做:Schema Registry、Connect、REST Proxy 的 JMX exporter(儀表板這兩區空白);未測:磁碟告警實際觸發、Grafana 高可用與外部資料庫、Grafana 告警(本案告警走 Prometheus)</w:t>
+              <w:t xml:space="preserve">已實測:8 個官方儀表板 245 個查詢 171 個有資料(含 Schema Registry、Connect、REST Proxy,13 個 JMX exporter 都是 HTTPS + Basic)、node_exporter 與 kafka_exporter、AD 登入;未測:磁碟告警實際觸發、Grafana 高可用與外部資料庫、Grafana 告警(本案告警走 Prometheus)</w:t>
             </w:r>
           </w:p>
         </w:tc>

</xml_diff>